<commit_message>
docs: update UAT plan + guide + deployment plan for the LIVE Trust hand-off
- UAT workbook Capacity & Trust: TRU-011 (engine now remote/live), TRU-012
  (hand-off happy path replaces 'no handoff today'), new TRU-033 (return +
  read-back) + TRU-034 (availability gate / kill switch); coverage summary reworded.
- UAT_Guide.md: 'things to know' now describes the live hand-off, not a dormant seam.
- PRODUCTION_DEPLOYMENT_PLAN.md: added the Kuja Trust hand-off env vars
  (KUJA_TRUST_HANDOFF_SECRET + KUJA_TRUST_SERVICE_TOKEN shared on BOTH services,
  KUJA_TRUST_BASE_URL/ENGINE/GRANT_BASE_URL on Grant) to the launch checklist.

Co-Authored-By: Claude Opus 4.8 <noreply@anthropic.com>
</commit_message>
<xml_diff>
--- a/docs/Kuja_Production_Deployment_Plan_2026-08-15.docx
+++ b/docs/Kuja_Production_Deployment_Plan_2026-08-15.docx
@@ -2,32 +2,6 @@
 <file path=word/document.xml><?xml version="1.0" encoding="utf-8"?>
 <w:document xmlns:w="http://schemas.openxmlformats.org/wordprocessingml/2006/main" xmlns:m="http://schemas.openxmlformats.org/officeDocument/2006/math" xmlns:r="http://schemas.openxmlformats.org/officeDocument/2006/relationships" xmlns:o="urn:schemas-microsoft-com:office:office" xmlns:v="urn:schemas-microsoft-com:vml" xmlns:w10="urn:schemas-microsoft-com:office:word" xmlns:a="http://schemas.openxmlformats.org/drawingml/2006/main" xmlns:pic="http://schemas.openxmlformats.org/drawingml/2006/picture" xmlns:wp="http://schemas.openxmlformats.org/drawingml/2006/wordprocessingDrawing">
   <w:body>
-    <w:sdt>
-      <w:sdtPr>
-        <w:docPartObj>
-          <w:docPartGallery w:val="Table of Contents"/>
-          <w:docPartUnique/>
-        </w:docPartObj>
-      </w:sdtPr>
-      <w:sdtContent>
-        <w:p>
-          <w:pPr>
-            <w:pStyle w:val="TOCHeading"/>
-          </w:pPr>
-          <w:r>
-            <w:t xml:space="preserve">Table of Contents</w:t>
-          </w:r>
-        </w:p>
-        <w:p>
-          <w:r>
-            <w:fldChar w:fldCharType="begin" w:dirty="true"/>
-            <w:instrText xml:space="preserve">TOC \o "1-2" \h \z \u</w:instrText>
-            <w:fldChar w:fldCharType="separate"/>
-            <w:fldChar w:fldCharType="end"/>
-          </w:r>
-        </w:p>
-      </w:sdtContent>
-    </w:sdt>
     <w:bookmarkStart w:id="28" w:name="X4debb6e517dff83a2bc35c7b3222558807145b4"/>
     <w:p>
       <w:pPr>
@@ -6417,6 +6391,184 @@
       </w:r>
       <w:r>
         <w:t xml:space="preserve">.</w:t>
+      </w:r>
+    </w:p>
+    <w:p>
+      <w:pPr>
+        <w:pStyle w:val="BodyText"/>
+      </w:pPr>
+      <w:r>
+        <w:rPr>
+          <w:b/>
+          <w:bCs/>
+        </w:rPr>
+        <w:t xml:space="preserve">Kuja Trust hand-off (capacity assessment — LIVE, see</w:t>
+      </w:r>
+      <w:r>
+        <w:rPr>
+          <w:b/>
+          <w:bCs/>
+        </w:rPr>
+        <w:t xml:space="preserve"> </w:t>
+      </w:r>
+      <w:r>
+        <w:rPr>
+          <w:rStyle w:val="VerbatimChar"/>
+          <w:b/>
+          <w:bCs/>
+        </w:rPr>
+        <w:t xml:space="preserve">docs/TRUST_HANDOFF_DESIGN.md</w:t>
+      </w:r>
+      <w:r>
+        <w:rPr>
+          <w:b/>
+          <w:bCs/>
+        </w:rPr>
+        <w:t xml:space="preserve">):</w:t>
+      </w:r>
+      <w:r>
+        <w:t xml:space="preserve"> </w:t>
+      </w:r>
+      <w:r>
+        <w:t xml:space="preserve">a shared secret pair must be set identically on BOTH deployments — the Grant</w:t>
+      </w:r>
+      <w:r>
+        <w:t xml:space="preserve"> </w:t>
+      </w:r>
+      <w:r>
+        <w:rPr>
+          <w:rStyle w:val="VerbatimChar"/>
+        </w:rPr>
+        <w:t xml:space="preserve">web</w:t>
+      </w:r>
+      <w:r>
+        <w:t xml:space="preserve"> </w:t>
+      </w:r>
+      <w:r>
+        <w:t xml:space="preserve">service AND the Kuja Trust</w:t>
+      </w:r>
+      <w:r>
+        <w:t xml:space="preserve"> </w:t>
+      </w:r>
+      <w:r>
+        <w:rPr>
+          <w:rStyle w:val="VerbatimChar"/>
+        </w:rPr>
+        <w:t xml:space="preserve">kuja-app</w:t>
+      </w:r>
+      <w:r>
+        <w:t xml:space="preserve"> </w:t>
+      </w:r>
+      <w:r>
+        <w:t xml:space="preserve">service — or the hand-off/read-back stays off:</w:t>
+      </w:r>
+      <w:r>
+        <w:t xml:space="preserve"> </w:t>
+      </w:r>
+      <w:r>
+        <w:t xml:space="preserve">-</w:t>
+      </w:r>
+      <w:r>
+        <w:t xml:space="preserve"> </w:t>
+      </w:r>
+      <w:r>
+        <w:rPr>
+          <w:rStyle w:val="VerbatimChar"/>
+        </w:rPr>
+        <w:t xml:space="preserve">KUJA_TRUST_HANDOFF_SECRET</w:t>
+      </w:r>
+      <w:r>
+        <w:t xml:space="preserve"> </w:t>
+      </w:r>
+      <w:r>
+        <w:t xml:space="preserve">— shared HS256 signing secret for the hand-off link (Grant mints, Trust verifies). Unset = feature hidden/inert (kill switch).</w:t>
+      </w:r>
+      <w:r>
+        <w:t xml:space="preserve"> </w:t>
+      </w:r>
+      <w:r>
+        <w:t xml:space="preserve">-</w:t>
+      </w:r>
+      <w:r>
+        <w:t xml:space="preserve"> </w:t>
+      </w:r>
+      <w:r>
+        <w:rPr>
+          <w:rStyle w:val="VerbatimChar"/>
+        </w:rPr>
+        <w:t xml:space="preserve">KUJA_TRUST_SERVICE_TOKEN</w:t>
+      </w:r>
+      <w:r>
+        <w:t xml:space="preserve"> </w:t>
+      </w:r>
+      <w:r>
+        <w:t xml:space="preserve">— shared bearer for the</w:t>
+      </w:r>
+      <w:r>
+        <w:t xml:space="preserve"> </w:t>
+      </w:r>
+      <w:r>
+        <w:rPr>
+          <w:rStyle w:val="VerbatimChar"/>
+        </w:rPr>
+        <w:t xml:space="preserve">/api/service/*</w:t>
+      </w:r>
+      <w:r>
+        <w:t xml:space="preserve"> </w:t>
+      </w:r>
+      <w:r>
+        <w:t xml:space="preserve">read-back (Grant sends, Trust validates). Must match on both.</w:t>
+      </w:r>
+      <w:r>
+        <w:t xml:space="preserve"> </w:t>
+      </w:r>
+      <w:r>
+        <w:t xml:space="preserve">- Grant only:</w:t>
+      </w:r>
+      <w:r>
+        <w:t xml:space="preserve"> </w:t>
+      </w:r>
+      <w:r>
+        <w:rPr>
+          <w:rStyle w:val="VerbatimChar"/>
+        </w:rPr>
+        <w:t xml:space="preserve">KUJA_TRUST_BASE_URL</w:t>
+      </w:r>
+      <w:r>
+        <w:t xml:space="preserve"> </w:t>
+      </w:r>
+      <w:r>
+        <w:t xml:space="preserve">(the Trust app URL),</w:t>
+      </w:r>
+      <w:r>
+        <w:t xml:space="preserve"> </w:t>
+      </w:r>
+      <w:r>
+        <w:rPr>
+          <w:rStyle w:val="VerbatimChar"/>
+        </w:rPr>
+        <w:t xml:space="preserve">KUJA_TRUST_ENGINE=remote</w:t>
+      </w:r>
+      <w:r>
+        <w:t xml:space="preserve"> </w:t>
+      </w:r>
+      <w:r>
+        <w:t xml:space="preserve">(turns read-back on; falls back to local if Trust is down),</w:t>
+      </w:r>
+      <w:r>
+        <w:t xml:space="preserve"> </w:t>
+      </w:r>
+      <w:r>
+        <w:rPr>
+          <w:rStyle w:val="VerbatimChar"/>
+        </w:rPr>
+        <w:t xml:space="preserve">KUJA_GRANT_BASE_URL</w:t>
+      </w:r>
+      <w:r>
+        <w:t xml:space="preserve"> </w:t>
+      </w:r>
+      <w:r>
+        <w:t xml:space="preserve">(this app’s public URL, for the signed return link). Rotate the secret pair on both services together.</w:t>
       </w:r>
     </w:p>
     <w:p>

</xml_diff>